<commit_message>
Modified DOC for Llama 3.3
</commit_message>
<xml_diff>
--- a/Project Overview.docx
+++ b/Project Overview.docx
@@ -104,7 +104,21 @@
         <w:rPr>
           <w:rFonts w:ascii="Times New Roman" w:hAnsi="Times New Roman" w:cs="Times New Roman"/>
         </w:rPr>
-        <w:t>The system accepts a video as input, converts speech into text using OpenAI Whisper, evaluates the resulting transcript using a combination of local NLP techniques and Large Language Models, and presents detailed feedback through a Streamlit-based dashboard.</w:t>
+        <w:t xml:space="preserve">The system accepts a video as input, converts speech into text using OpenAI Whisper, evaluates the resulting transcript using a combination of local NLP techniques and Large Language Models, and presents detailed feedback through a </w:t>
+      </w:r>
+      <w:proofErr w:type="spellStart"/>
+      <w:r>
+        <w:rPr>
+          <w:rFonts w:ascii="Times New Roman" w:hAnsi="Times New Roman" w:cs="Times New Roman"/>
+        </w:rPr>
+        <w:t>Streamlit</w:t>
+      </w:r>
+      <w:proofErr w:type="spellEnd"/>
+      <w:r>
+        <w:rPr>
+          <w:rFonts w:ascii="Times New Roman" w:hAnsi="Times New Roman" w:cs="Times New Roman"/>
+        </w:rPr>
+        <w:t>-based dashboard.</w:t>
       </w:r>
     </w:p>
     <w:p>
@@ -300,7 +314,21 @@
         <w:rPr>
           <w:rFonts w:ascii="Times New Roman" w:hAnsi="Times New Roman" w:cs="Times New Roman"/>
         </w:rPr>
-        <w:t>Evaluates grammar using LanguageTool.</w:t>
+        <w:t xml:space="preserve">Evaluates grammar using </w:t>
+      </w:r>
+      <w:proofErr w:type="spellStart"/>
+      <w:r>
+        <w:rPr>
+          <w:rFonts w:ascii="Times New Roman" w:hAnsi="Times New Roman" w:cs="Times New Roman"/>
+        </w:rPr>
+        <w:t>LanguageTool</w:t>
+      </w:r>
+      <w:proofErr w:type="spellEnd"/>
+      <w:r>
+        <w:rPr>
+          <w:rFonts w:ascii="Times New Roman" w:hAnsi="Times New Roman" w:cs="Times New Roman"/>
+        </w:rPr>
+        <w:t>.</w:t>
       </w:r>
     </w:p>
     <w:p>
@@ -336,7 +364,21 @@
         <w:rPr>
           <w:rFonts w:ascii="Times New Roman" w:hAnsi="Times New Roman" w:cs="Times New Roman"/>
         </w:rPr>
-        <w:t>Uses Gemini to evaluate clarity, technical accuracy, and professionalism.</w:t>
+        <w:t xml:space="preserve">Uses </w:t>
+      </w:r>
+      <w:proofErr w:type="spellStart"/>
+      <w:r>
+        <w:rPr>
+          <w:rFonts w:ascii="Times New Roman" w:hAnsi="Times New Roman" w:cs="Times New Roman"/>
+        </w:rPr>
+        <w:t>Groq</w:t>
+      </w:r>
+      <w:proofErr w:type="spellEnd"/>
+      <w:r>
+        <w:rPr>
+          <w:rFonts w:ascii="Times New Roman" w:hAnsi="Times New Roman" w:cs="Times New Roman"/>
+        </w:rPr>
+        <w:t>-hosted Llama 3.3 70B Versatile to evaluate clarity, technical accuracy, and professionalism.</w:t>
       </w:r>
     </w:p>
     <w:p>
@@ -372,7 +414,21 @@
         <w:rPr>
           <w:rFonts w:ascii="Times New Roman" w:hAnsi="Times New Roman" w:cs="Times New Roman"/>
         </w:rPr>
-        <w:t>Displays results through an interactive Streamlit interface.</w:t>
+        <w:t xml:space="preserve">Displays results through an interactive </w:t>
+      </w:r>
+      <w:proofErr w:type="spellStart"/>
+      <w:r>
+        <w:rPr>
+          <w:rFonts w:ascii="Times New Roman" w:hAnsi="Times New Roman" w:cs="Times New Roman"/>
+        </w:rPr>
+        <w:t>Streamlit</w:t>
+      </w:r>
+      <w:proofErr w:type="spellEnd"/>
+      <w:r>
+        <w:rPr>
+          <w:rFonts w:ascii="Times New Roman" w:hAnsi="Times New Roman" w:cs="Times New Roman"/>
+        </w:rPr>
+        <w:t xml:space="preserve"> interface.</w:t>
       </w:r>
     </w:p>
     <w:p>
@@ -421,7 +477,6 @@
           <w:sz w:val="28"/>
           <w:szCs w:val="28"/>
         </w:rPr>
-        <w:lastRenderedPageBreak/>
         <w:t xml:space="preserve">2. </w:t>
       </w:r>
       <w:r>
@@ -565,7 +620,21 @@
         <w:rPr>
           <w:rFonts w:ascii="Times New Roman" w:hAnsi="Times New Roman" w:cs="Times New Roman"/>
         </w:rPr>
-        <w:t>The objective of this project was to develop an automated transcript evaluation system capable of analyzing spoken responses from video recordings and generating meaningful feedback across multiple communication dimensions.</w:t>
+        <w:t xml:space="preserve">The objective of this project was to develop an automated transcript evaluation system capable of </w:t>
+      </w:r>
+      <w:proofErr w:type="spellStart"/>
+      <w:r>
+        <w:rPr>
+          <w:rFonts w:ascii="Times New Roman" w:hAnsi="Times New Roman" w:cs="Times New Roman"/>
+        </w:rPr>
+        <w:t>analyzing</w:t>
+      </w:r>
+      <w:proofErr w:type="spellEnd"/>
+      <w:r>
+        <w:rPr>
+          <w:rFonts w:ascii="Times New Roman" w:hAnsi="Times New Roman" w:cs="Times New Roman"/>
+        </w:rPr>
+        <w:t xml:space="preserve"> spoken responses from video recordings and generating meaningful feedback across multiple communication dimensions.</w:t>
       </w:r>
     </w:p>
     <w:p>
@@ -1215,6 +1284,7 @@
         <w:rPr>
           <w:rFonts w:ascii="Times New Roman" w:hAnsi="Times New Roman" w:cs="Times New Roman"/>
         </w:rPr>
+        <w:lastRenderedPageBreak/>
         <w:t>The transcript is passed to multiple evaluation modules.</w:t>
       </w:r>
     </w:p>
@@ -1233,7 +1303,6 @@
         <w:rPr>
           <w:rFonts w:ascii="Times New Roman" w:hAnsi="Times New Roman" w:cs="Times New Roman"/>
         </w:rPr>
-        <w:lastRenderedPageBreak/>
         <w:t>Grammar and vocabulary are evaluated locally.</w:t>
       </w:r>
     </w:p>
@@ -1252,7 +1321,21 @@
         <w:rPr>
           <w:rFonts w:ascii="Times New Roman" w:hAnsi="Times New Roman" w:cs="Times New Roman"/>
         </w:rPr>
-        <w:t>Clarity, technical accuracy, and professionalism are evaluated using Gemini.</w:t>
+        <w:t xml:space="preserve">5. Clarity, technical accuracy, and professionalism are evaluated using </w:t>
+      </w:r>
+      <w:proofErr w:type="spellStart"/>
+      <w:r>
+        <w:rPr>
+          <w:rFonts w:ascii="Times New Roman" w:hAnsi="Times New Roman" w:cs="Times New Roman"/>
+        </w:rPr>
+        <w:t>Groq</w:t>
+      </w:r>
+      <w:proofErr w:type="spellEnd"/>
+      <w:r>
+        <w:rPr>
+          <w:rFonts w:ascii="Times New Roman" w:hAnsi="Times New Roman" w:cs="Times New Roman"/>
+        </w:rPr>
+        <w:t>-hosted Llama 3.3 70B Versatile.</w:t>
       </w:r>
     </w:p>
     <w:p>
@@ -1288,7 +1371,21 @@
         <w:rPr>
           <w:rFonts w:ascii="Times New Roman" w:hAnsi="Times New Roman" w:cs="Times New Roman"/>
         </w:rPr>
-        <w:t>Results are displayed through the Streamlit dashboard.</w:t>
+        <w:t xml:space="preserve">Results are displayed through the </w:t>
+      </w:r>
+      <w:proofErr w:type="spellStart"/>
+      <w:r>
+        <w:rPr>
+          <w:rFonts w:ascii="Times New Roman" w:hAnsi="Times New Roman" w:cs="Times New Roman"/>
+        </w:rPr>
+        <w:t>Streamlit</w:t>
+      </w:r>
+      <w:proofErr w:type="spellEnd"/>
+      <w:r>
+        <w:rPr>
+          <w:rFonts w:ascii="Times New Roman" w:hAnsi="Times New Roman" w:cs="Times New Roman"/>
+        </w:rPr>
+        <w:t xml:space="preserve"> dashboard.</w:t>
       </w:r>
     </w:p>
     <w:p>
@@ -1323,21 +1420,12 @@
           <w:rFonts w:ascii="Times New Roman" w:hAnsi="Times New Roman" w:cs="Times New Roman"/>
           <w:b/>
           <w:bCs/>
-          <w:noProof/>
         </w:rPr>
         <w:drawing>
-          <wp:anchor distT="0" distB="0" distL="114300" distR="114300" simplePos="0" relativeHeight="251658240" behindDoc="0" locked="0" layoutInCell="1" allowOverlap="1" wp14:anchorId="44DA5D1A" wp14:editId="7157E7AB">
-            <wp:simplePos x="0" y="0"/>
-            <wp:positionH relativeFrom="margin">
-              <wp:posOffset>-323850</wp:posOffset>
-            </wp:positionH>
-            <wp:positionV relativeFrom="margin">
-              <wp:posOffset>1543050</wp:posOffset>
-            </wp:positionV>
-            <wp:extent cx="6416675" cy="3581400"/>
-            <wp:effectExtent l="0" t="0" r="3175" b="0"/>
-            <wp:wrapSquare wrapText="bothSides"/>
-            <wp:docPr id="548937323" name="Picture 1"/>
+          <wp:inline distT="0" distB="0" distL="0" distR="0" wp14:anchorId="6E06995A" wp14:editId="6A432474">
+            <wp:extent cx="5731510" cy="3079750"/>
+            <wp:effectExtent l="0" t="0" r="2540" b="6350"/>
+            <wp:docPr id="1396830166" name="Picture 1"/>
             <wp:cNvGraphicFramePr>
               <a:graphicFrameLocks xmlns:a="http://schemas.openxmlformats.org/drawingml/2006/main" noChangeAspect="1"/>
             </wp:cNvGraphicFramePr>
@@ -1345,17 +1433,11 @@
               <a:graphicData uri="http://schemas.openxmlformats.org/drawingml/2006/picture">
                 <pic:pic xmlns:pic="http://schemas.openxmlformats.org/drawingml/2006/picture">
                   <pic:nvPicPr>
-                    <pic:cNvPr id="548937323" name=""/>
+                    <pic:cNvPr id="1396830166" name=""/>
                     <pic:cNvPicPr/>
                   </pic:nvPicPr>
                   <pic:blipFill>
-                    <a:blip r:embed="rId8">
-                      <a:extLst>
-                        <a:ext uri="{28A0092B-C50C-407E-A947-70E740481C1C}">
-                          <a14:useLocalDpi xmlns:a14="http://schemas.microsoft.com/office/drawing/2010/main" val="0"/>
-                        </a:ext>
-                      </a:extLst>
-                    </a:blip>
+                    <a:blip r:embed="rId8"/>
                     <a:stretch>
                       <a:fillRect/>
                     </a:stretch>
@@ -1363,7 +1445,7 @@
                   <pic:spPr>
                     <a:xfrm>
                       <a:off x="0" y="0"/>
-                      <a:ext cx="6416675" cy="3581400"/>
+                      <a:ext cx="5731510" cy="3079750"/>
                     </a:xfrm>
                     <a:prstGeom prst="rect">
                       <a:avLst/>
@@ -1372,13 +1454,7 @@
                 </pic:pic>
               </a:graphicData>
             </a:graphic>
-            <wp14:sizeRelH relativeFrom="margin">
-              <wp14:pctWidth>0</wp14:pctWidth>
-            </wp14:sizeRelH>
-            <wp14:sizeRelV relativeFrom="margin">
-              <wp14:pctHeight>0</wp14:pctHeight>
-            </wp14:sizeRelV>
-          </wp:anchor>
+          </wp:inline>
         </w:drawing>
       </w:r>
     </w:p>
@@ -1589,7 +1665,21 @@
         <w:rPr>
           <w:rFonts w:ascii="Times New Roman" w:hAnsi="Times New Roman" w:cs="Times New Roman"/>
         </w:rPr>
-        <w:t>The AI evaluation layer uses Google's Gemini model to assess communication characteristics that require contextual understanding and reasoning.</w:t>
+        <w:t xml:space="preserve">The AI evaluation layer uses Meta's Llama 3.3 70B Versatile model through the </w:t>
+      </w:r>
+      <w:proofErr w:type="spellStart"/>
+      <w:r>
+        <w:rPr>
+          <w:rFonts w:ascii="Times New Roman" w:hAnsi="Times New Roman" w:cs="Times New Roman"/>
+        </w:rPr>
+        <w:t>Groq</w:t>
+      </w:r>
+      <w:proofErr w:type="spellEnd"/>
+      <w:r>
+        <w:rPr>
+          <w:rFonts w:ascii="Times New Roman" w:hAnsi="Times New Roman" w:cs="Times New Roman"/>
+        </w:rPr>
+        <w:t xml:space="preserve"> API to assess communication characteristics that require contextual understanding and reasoning.</w:t>
       </w:r>
     </w:p>
     <w:p>
@@ -1715,7 +1805,21 @@
         <w:rPr>
           <w:rFonts w:ascii="Times New Roman" w:hAnsi="Times New Roman" w:cs="Times New Roman"/>
         </w:rPr>
-        <w:t>The Streamlit frontend presents:</w:t>
+        <w:t xml:space="preserve">The </w:t>
+      </w:r>
+      <w:proofErr w:type="spellStart"/>
+      <w:r>
+        <w:rPr>
+          <w:rFonts w:ascii="Times New Roman" w:hAnsi="Times New Roman" w:cs="Times New Roman"/>
+        </w:rPr>
+        <w:t>Streamlit</w:t>
+      </w:r>
+      <w:proofErr w:type="spellEnd"/>
+      <w:r>
+        <w:rPr>
+          <w:rFonts w:ascii="Times New Roman" w:hAnsi="Times New Roman" w:cs="Times New Roman"/>
+        </w:rPr>
+        <w:t xml:space="preserve"> frontend presents:</w:t>
       </w:r>
     </w:p>
     <w:p>
@@ -1967,7 +2071,13 @@
         <w:rPr>
           <w:rFonts w:ascii="Times New Roman" w:hAnsi="Times New Roman" w:cs="Times New Roman"/>
         </w:rPr>
-        <w:t>By assigning objective metrics to local computation and subjective metrics to Gemini, the system avoids unnecessary AI usage while preserving evaluation quality.</w:t>
+        <w:t>By assigning objective metrics to local computation and subjective metrics to Llama 3.3 70B Versatile</w:t>
+      </w:r>
+      <w:r>
+        <w:rPr>
+          <w:rFonts w:ascii="Times New Roman" w:hAnsi="Times New Roman" w:cs="Times New Roman"/>
+        </w:rPr>
+        <w:t>.</w:t>
       </w:r>
     </w:p>
     <w:p>
@@ -2364,61 +2474,49 @@
         <w:rPr>
           <w:rFonts w:ascii="Times New Roman" w:hAnsi="Times New Roman" w:cs="Times New Roman"/>
         </w:rPr>
-        <w:t>Gemini Evaluation:</w:t>
-      </w:r>
-    </w:p>
-    <w:p>
-      <w:pPr>
-        <w:numPr>
-          <w:ilvl w:val="0"/>
-          <w:numId w:val="13"/>
-        </w:numPr>
-        <w:jc w:val="both"/>
-        <w:rPr>
-          <w:rFonts w:ascii="Times New Roman" w:hAnsi="Times New Roman" w:cs="Times New Roman"/>
-        </w:rPr>
-      </w:pPr>
-      <w:r>
-        <w:rPr>
-          <w:rFonts w:ascii="Times New Roman" w:hAnsi="Times New Roman" w:cs="Times New Roman"/>
-        </w:rPr>
-        <w:t>Clarity</w:t>
-      </w:r>
-    </w:p>
-    <w:p>
-      <w:pPr>
-        <w:numPr>
-          <w:ilvl w:val="0"/>
-          <w:numId w:val="13"/>
-        </w:numPr>
-        <w:jc w:val="both"/>
-        <w:rPr>
-          <w:rFonts w:ascii="Times New Roman" w:hAnsi="Times New Roman" w:cs="Times New Roman"/>
-        </w:rPr>
-      </w:pPr>
-      <w:r>
-        <w:rPr>
-          <w:rFonts w:ascii="Times New Roman" w:hAnsi="Times New Roman" w:cs="Times New Roman"/>
-        </w:rPr>
-        <w:t>Technical Accuracy</w:t>
-      </w:r>
-    </w:p>
-    <w:p>
-      <w:pPr>
-        <w:numPr>
-          <w:ilvl w:val="0"/>
-          <w:numId w:val="13"/>
-        </w:numPr>
-        <w:jc w:val="both"/>
-        <w:rPr>
-          <w:rFonts w:ascii="Times New Roman" w:hAnsi="Times New Roman" w:cs="Times New Roman"/>
-        </w:rPr>
-      </w:pPr>
-      <w:r>
-        <w:rPr>
-          <w:rFonts w:ascii="Times New Roman" w:hAnsi="Times New Roman" w:cs="Times New Roman"/>
-        </w:rPr>
-        <w:t>Professionalism</w:t>
+        <w:t>Llama 3.3 70B Evaluation:</w:t>
+      </w:r>
+    </w:p>
+    <w:p>
+      <w:pPr>
+        <w:jc w:val="both"/>
+        <w:rPr>
+          <w:rFonts w:ascii="Times New Roman" w:hAnsi="Times New Roman" w:cs="Times New Roman"/>
+        </w:rPr>
+      </w:pPr>
+      <w:r>
+        <w:rPr>
+          <w:rFonts w:ascii="Times New Roman" w:hAnsi="Times New Roman" w:cs="Times New Roman"/>
+        </w:rPr>
+        <w:t>• Clarity</w:t>
+      </w:r>
+    </w:p>
+    <w:p>
+      <w:pPr>
+        <w:jc w:val="both"/>
+        <w:rPr>
+          <w:rFonts w:ascii="Times New Roman" w:hAnsi="Times New Roman" w:cs="Times New Roman"/>
+        </w:rPr>
+      </w:pPr>
+      <w:r>
+        <w:rPr>
+          <w:rFonts w:ascii="Times New Roman" w:hAnsi="Times New Roman" w:cs="Times New Roman"/>
+        </w:rPr>
+        <w:t>• Technical Accuracy</w:t>
+      </w:r>
+    </w:p>
+    <w:p>
+      <w:pPr>
+        <w:jc w:val="both"/>
+        <w:rPr>
+          <w:rFonts w:ascii="Times New Roman" w:hAnsi="Times New Roman" w:cs="Times New Roman"/>
+        </w:rPr>
+      </w:pPr>
+      <w:r>
+        <w:rPr>
+          <w:rFonts w:ascii="Times New Roman" w:hAnsi="Times New Roman" w:cs="Times New Roman"/>
+        </w:rPr>
+        <w:t>• Professionalism</w:t>
       </w:r>
     </w:p>
     <w:p>
@@ -3292,16 +3390,14 @@
         <w:rPr>
           <w:rFonts w:ascii="Times New Roman" w:hAnsi="Times New Roman" w:cs="Times New Roman"/>
         </w:rPr>
-        <w:t>Evaluate professionalism using Gemini.</w:t>
-      </w:r>
-    </w:p>
-    <w:p>
-      <w:pPr>
-        <w:jc w:val="both"/>
-        <w:rPr>
-          <w:rFonts w:ascii="Times New Roman" w:hAnsi="Times New Roman" w:cs="Times New Roman"/>
-        </w:rPr>
-      </w:pPr>
+        <w:t xml:space="preserve">Evaluate professionalism using </w:t>
+      </w:r>
+      <w:r>
+        <w:rPr>
+          <w:rFonts w:ascii="Times New Roman" w:hAnsi="Times New Roman" w:cs="Times New Roman"/>
+        </w:rPr>
+        <w:t>Llama 3.3 70B Versatile.</w:t>
+      </w:r>
     </w:p>
     <w:p>
       <w:pPr>
@@ -3526,7 +3622,19 @@
         <w:rPr>
           <w:rFonts w:ascii="Times New Roman" w:hAnsi="Times New Roman" w:cs="Times New Roman"/>
         </w:rPr>
-        <w:t>Use Gemini to evaluate clarity.</w:t>
+        <w:t xml:space="preserve">Use </w:t>
+      </w:r>
+      <w:r>
+        <w:rPr>
+          <w:rFonts w:ascii="Times New Roman" w:hAnsi="Times New Roman" w:cs="Times New Roman"/>
+        </w:rPr>
+        <w:t>Llama 3.3 70B Versatile</w:t>
+      </w:r>
+      <w:r>
+        <w:rPr>
+          <w:rFonts w:ascii="Times New Roman" w:hAnsi="Times New Roman" w:cs="Times New Roman"/>
+        </w:rPr>
+        <w:t xml:space="preserve"> to evaluate clarity.</w:t>
       </w:r>
     </w:p>
     <w:p>
@@ -3656,7 +3764,13 @@
         <w:rPr>
           <w:rFonts w:ascii="Times New Roman" w:hAnsi="Times New Roman" w:cs="Times New Roman"/>
         </w:rPr>
-        <w:t>By evaluating objective metrics locally, only the categories requiring contextual reasoning are sent to Gemini.</w:t>
+        <w:t xml:space="preserve">By evaluating objective metrics locally, only the categories requiring contextual reasoning are sent to </w:t>
+      </w:r>
+      <w:r>
+        <w:rPr>
+          <w:rFonts w:ascii="Times New Roman" w:hAnsi="Times New Roman" w:cs="Times New Roman"/>
+        </w:rPr>
+        <w:t>Llama 3.3 70B Versatile.</w:t>
       </w:r>
     </w:p>
     <w:p>
@@ -3672,6 +3786,18 @@
         </w:rPr>
         <w:t>This significantly improves scalability while preserving evaluation quality.</w:t>
       </w:r>
+    </w:p>
+    <w:p>
+      <w:pPr>
+        <w:jc w:val="both"/>
+        <w:rPr>
+          <w:rFonts w:ascii="Times New Roman" w:hAnsi="Times New Roman" w:cs="Times New Roman"/>
+          <w:b/>
+          <w:bCs/>
+          <w:sz w:val="28"/>
+          <w:szCs w:val="28"/>
+        </w:rPr>
+      </w:pPr>
     </w:p>
     <w:p>
       <w:pPr>
@@ -3946,7 +4072,7 @@
       </w:tblPr>
       <w:tblGrid>
         <w:gridCol w:w="2284"/>
-        <w:gridCol w:w="2581"/>
+        <w:gridCol w:w="3570"/>
       </w:tblGrid>
       <w:tr>
         <w:trPr>
@@ -4042,12 +4168,14 @@
                 <w:rFonts w:ascii="Times New Roman" w:hAnsi="Times New Roman" w:cs="Times New Roman"/>
               </w:rPr>
             </w:pPr>
+            <w:proofErr w:type="spellStart"/>
             <w:r>
               <w:rPr>
                 <w:rFonts w:ascii="Times New Roman" w:hAnsi="Times New Roman" w:cs="Times New Roman"/>
               </w:rPr>
               <w:t>Streamlit</w:t>
             </w:r>
+            <w:proofErr w:type="spellEnd"/>
           </w:p>
         </w:tc>
       </w:tr>
@@ -4136,12 +4264,14 @@
                 <w:rFonts w:ascii="Times New Roman" w:hAnsi="Times New Roman" w:cs="Times New Roman"/>
               </w:rPr>
             </w:pPr>
+            <w:proofErr w:type="spellStart"/>
             <w:r>
               <w:rPr>
                 <w:rFonts w:ascii="Times New Roman" w:hAnsi="Times New Roman" w:cs="Times New Roman"/>
               </w:rPr>
               <w:t>LanguageTool</w:t>
             </w:r>
+            <w:proofErr w:type="spellEnd"/>
           </w:p>
         </w:tc>
       </w:tr>
@@ -4183,11 +4313,19 @@
                 <w:rFonts w:ascii="Times New Roman" w:hAnsi="Times New Roman" w:cs="Times New Roman"/>
               </w:rPr>
             </w:pPr>
+            <w:proofErr w:type="spellStart"/>
             <w:r>
               <w:rPr>
                 <w:rFonts w:ascii="Times New Roman" w:hAnsi="Times New Roman" w:cs="Times New Roman"/>
               </w:rPr>
-              <w:t>LexicalRichness (MTLD)</w:t>
+              <w:t>LexicalRichness</w:t>
+            </w:r>
+            <w:proofErr w:type="spellEnd"/>
+            <w:r>
+              <w:rPr>
+                <w:rFonts w:ascii="Times New Roman" w:hAnsi="Times New Roman" w:cs="Times New Roman"/>
+              </w:rPr>
+              <w:t xml:space="preserve"> (MTLD)</w:t>
             </w:r>
           </w:p>
         </w:tc>
@@ -4230,11 +4368,19 @@
                 <w:rFonts w:ascii="Times New Roman" w:hAnsi="Times New Roman" w:cs="Times New Roman"/>
               </w:rPr>
             </w:pPr>
+            <w:proofErr w:type="spellStart"/>
             <w:r>
               <w:rPr>
                 <w:rFonts w:ascii="Times New Roman" w:hAnsi="Times New Roman" w:cs="Times New Roman"/>
               </w:rPr>
-              <w:t>Google Gemini</w:t>
+              <w:t>Groq</w:t>
+            </w:r>
+            <w:proofErr w:type="spellEnd"/>
+            <w:r>
+              <w:rPr>
+                <w:rFonts w:ascii="Times New Roman" w:hAnsi="Times New Roman" w:cs="Times New Roman"/>
+              </w:rPr>
+              <w:t xml:space="preserve"> API (Llama 3.3 70B Versatile)</w:t>
             </w:r>
           </w:p>
         </w:tc>
@@ -4390,7 +4536,21 @@
         <w:rPr>
           <w:rFonts w:ascii="Times New Roman" w:hAnsi="Times New Roman" w:cs="Times New Roman"/>
         </w:rPr>
-        <w:t>The user interface was developed using Streamlit.</w:t>
+        <w:t xml:space="preserve">The user interface was developed using </w:t>
+      </w:r>
+      <w:proofErr w:type="spellStart"/>
+      <w:r>
+        <w:rPr>
+          <w:rFonts w:ascii="Times New Roman" w:hAnsi="Times New Roman" w:cs="Times New Roman"/>
+        </w:rPr>
+        <w:t>Streamlit</w:t>
+      </w:r>
+      <w:proofErr w:type="spellEnd"/>
+      <w:r>
+        <w:rPr>
+          <w:rFonts w:ascii="Times New Roman" w:hAnsi="Times New Roman" w:cs="Times New Roman"/>
+        </w:rPr>
+        <w:t>.</w:t>
       </w:r>
     </w:p>
     <w:p>
@@ -4602,7 +4762,21 @@
         <w:rPr>
           <w:rFonts w:ascii="Times New Roman" w:hAnsi="Times New Roman" w:cs="Times New Roman"/>
         </w:rPr>
-        <w:t>Audio is extracted using FFmpeg.</w:t>
+        <w:t xml:space="preserve">Audio is extracted using </w:t>
+      </w:r>
+      <w:proofErr w:type="spellStart"/>
+      <w:r>
+        <w:rPr>
+          <w:rFonts w:ascii="Times New Roman" w:hAnsi="Times New Roman" w:cs="Times New Roman"/>
+        </w:rPr>
+        <w:t>FFmpeg</w:t>
+      </w:r>
+      <w:proofErr w:type="spellEnd"/>
+      <w:r>
+        <w:rPr>
+          <w:rFonts w:ascii="Times New Roman" w:hAnsi="Times New Roman" w:cs="Times New Roman"/>
+        </w:rPr>
+        <w:t>.</w:t>
       </w:r>
     </w:p>
     <w:p>
@@ -4696,7 +4870,21 @@
         <w:rPr>
           <w:rFonts w:ascii="Times New Roman" w:hAnsi="Times New Roman" w:cs="Times New Roman"/>
         </w:rPr>
-        <w:t>Grammar evaluation is performed using LanguageTool.</w:t>
+        <w:t xml:space="preserve">Grammar evaluation is performed using </w:t>
+      </w:r>
+      <w:proofErr w:type="spellStart"/>
+      <w:r>
+        <w:rPr>
+          <w:rFonts w:ascii="Times New Roman" w:hAnsi="Times New Roman" w:cs="Times New Roman"/>
+        </w:rPr>
+        <w:t>LanguageTool</w:t>
+      </w:r>
+      <w:proofErr w:type="spellEnd"/>
+      <w:r>
+        <w:rPr>
+          <w:rFonts w:ascii="Times New Roman" w:hAnsi="Times New Roman" w:cs="Times New Roman"/>
+        </w:rPr>
+        <w:t>.</w:t>
       </w:r>
     </w:p>
     <w:p>
@@ -4981,75 +5169,80 @@
           <w:sz w:val="28"/>
           <w:szCs w:val="28"/>
         </w:rPr>
-        <w:t>Gemini Evaluation Module</w:t>
-      </w:r>
-    </w:p>
-    <w:p>
-      <w:pPr>
-        <w:jc w:val="both"/>
-        <w:rPr>
-          <w:rFonts w:ascii="Times New Roman" w:hAnsi="Times New Roman" w:cs="Times New Roman"/>
-        </w:rPr>
-      </w:pPr>
-      <w:r>
-        <w:rPr>
-          <w:rFonts w:ascii="Times New Roman" w:hAnsi="Times New Roman" w:cs="Times New Roman"/>
-        </w:rPr>
-        <w:t>Gemini is responsible for evaluating:</w:t>
-      </w:r>
-    </w:p>
-    <w:p>
-      <w:pPr>
-        <w:numPr>
-          <w:ilvl w:val="0"/>
-          <w:numId w:val="19"/>
-        </w:numPr>
-        <w:jc w:val="both"/>
-        <w:rPr>
-          <w:rFonts w:ascii="Times New Roman" w:hAnsi="Times New Roman" w:cs="Times New Roman"/>
-        </w:rPr>
-      </w:pPr>
-      <w:r>
-        <w:rPr>
-          <w:rFonts w:ascii="Times New Roman" w:hAnsi="Times New Roman" w:cs="Times New Roman"/>
-        </w:rPr>
-        <w:t>Clarity</w:t>
-      </w:r>
-    </w:p>
-    <w:p>
-      <w:pPr>
-        <w:numPr>
-          <w:ilvl w:val="0"/>
-          <w:numId w:val="19"/>
-        </w:numPr>
-        <w:jc w:val="both"/>
-        <w:rPr>
-          <w:rFonts w:ascii="Times New Roman" w:hAnsi="Times New Roman" w:cs="Times New Roman"/>
-        </w:rPr>
-      </w:pPr>
-      <w:r>
-        <w:rPr>
-          <w:rFonts w:ascii="Times New Roman" w:hAnsi="Times New Roman" w:cs="Times New Roman"/>
-        </w:rPr>
-        <w:t>Technical Accuracy</w:t>
-      </w:r>
-    </w:p>
-    <w:p>
-      <w:pPr>
-        <w:numPr>
-          <w:ilvl w:val="0"/>
-          <w:numId w:val="19"/>
-        </w:numPr>
-        <w:jc w:val="both"/>
-        <w:rPr>
-          <w:rFonts w:ascii="Times New Roman" w:hAnsi="Times New Roman" w:cs="Times New Roman"/>
-        </w:rPr>
-      </w:pPr>
-      <w:r>
-        <w:rPr>
-          <w:rFonts w:ascii="Times New Roman" w:hAnsi="Times New Roman" w:cs="Times New Roman"/>
-        </w:rPr>
-        <w:t>Professionalism</w:t>
+        <w:t>Llama 3.3 Evaluation Module</w:t>
+      </w:r>
+    </w:p>
+    <w:p>
+      <w:pPr>
+        <w:jc w:val="both"/>
+        <w:rPr>
+          <w:rFonts w:ascii="Times New Roman" w:hAnsi="Times New Roman" w:cs="Times New Roman"/>
+        </w:rPr>
+      </w:pPr>
+      <w:r>
+        <w:rPr>
+          <w:rFonts w:ascii="Times New Roman" w:hAnsi="Times New Roman" w:cs="Times New Roman"/>
+        </w:rPr>
+        <w:t xml:space="preserve">Llama 3.3 70B Versatile, accessed through the </w:t>
+      </w:r>
+      <w:proofErr w:type="spellStart"/>
+      <w:r>
+        <w:rPr>
+          <w:rFonts w:ascii="Times New Roman" w:hAnsi="Times New Roman" w:cs="Times New Roman"/>
+        </w:rPr>
+        <w:t>Groq</w:t>
+      </w:r>
+      <w:proofErr w:type="spellEnd"/>
+      <w:r>
+        <w:rPr>
+          <w:rFonts w:ascii="Times New Roman" w:hAnsi="Times New Roman" w:cs="Times New Roman"/>
+        </w:rPr>
+        <w:t xml:space="preserve"> API, is responsible for evaluating</w:t>
+      </w:r>
+    </w:p>
+    <w:p>
+      <w:pPr>
+        <w:ind w:firstLine="720"/>
+        <w:jc w:val="both"/>
+        <w:rPr>
+          <w:rFonts w:ascii="Times New Roman" w:hAnsi="Times New Roman" w:cs="Times New Roman"/>
+        </w:rPr>
+      </w:pPr>
+      <w:r>
+        <w:rPr>
+          <w:rFonts w:ascii="Times New Roman" w:hAnsi="Times New Roman" w:cs="Times New Roman"/>
+        </w:rPr>
+        <w:t>• Clarity</w:t>
+      </w:r>
+    </w:p>
+    <w:p>
+      <w:pPr>
+        <w:ind w:firstLine="720"/>
+        <w:jc w:val="both"/>
+        <w:rPr>
+          <w:rFonts w:ascii="Times New Roman" w:hAnsi="Times New Roman" w:cs="Times New Roman"/>
+        </w:rPr>
+      </w:pPr>
+      <w:r>
+        <w:rPr>
+          <w:rFonts w:ascii="Times New Roman" w:hAnsi="Times New Roman" w:cs="Times New Roman"/>
+        </w:rPr>
+        <w:t>• Technical Accuracy</w:t>
+      </w:r>
+    </w:p>
+    <w:p>
+      <w:pPr>
+        <w:ind w:firstLine="720"/>
+        <w:jc w:val="both"/>
+        <w:rPr>
+          <w:rFonts w:ascii="Times New Roman" w:hAnsi="Times New Roman" w:cs="Times New Roman"/>
+        </w:rPr>
+      </w:pPr>
+      <w:r>
+        <w:rPr>
+          <w:rFonts w:ascii="Times New Roman" w:hAnsi="Times New Roman" w:cs="Times New Roman"/>
+        </w:rPr>
+        <w:t>• Professionalism</w:t>
       </w:r>
     </w:p>
     <w:p>
@@ -5068,115 +5261,92 @@
     </w:p>
     <w:p>
       <w:pPr>
-        <w:numPr>
-          <w:ilvl w:val="0"/>
-          <w:numId w:val="20"/>
-        </w:numPr>
-        <w:jc w:val="both"/>
-        <w:rPr>
-          <w:rFonts w:ascii="Times New Roman" w:hAnsi="Times New Roman" w:cs="Times New Roman"/>
-        </w:rPr>
-      </w:pPr>
-      <w:r>
-        <w:rPr>
-          <w:rFonts w:ascii="Times New Roman" w:hAnsi="Times New Roman" w:cs="Times New Roman"/>
-        </w:rPr>
-        <w:t>Receive transcript.</w:t>
-      </w:r>
-    </w:p>
-    <w:p>
-      <w:pPr>
-        <w:numPr>
-          <w:ilvl w:val="0"/>
-          <w:numId w:val="20"/>
-        </w:numPr>
-        <w:jc w:val="both"/>
-        <w:rPr>
-          <w:rFonts w:ascii="Times New Roman" w:hAnsi="Times New Roman" w:cs="Times New Roman"/>
-        </w:rPr>
-      </w:pPr>
-      <w:r>
-        <w:rPr>
-          <w:rFonts w:ascii="Times New Roman" w:hAnsi="Times New Roman" w:cs="Times New Roman"/>
-        </w:rPr>
-        <w:t>Send transcript to Gemini.</w:t>
-      </w:r>
-    </w:p>
-    <w:p>
-      <w:pPr>
-        <w:numPr>
-          <w:ilvl w:val="0"/>
-          <w:numId w:val="20"/>
-        </w:numPr>
-        <w:jc w:val="both"/>
-        <w:rPr>
-          <w:rFonts w:ascii="Times New Roman" w:hAnsi="Times New Roman" w:cs="Times New Roman"/>
-        </w:rPr>
-      </w:pPr>
-      <w:r>
-        <w:rPr>
-          <w:rFonts w:ascii="Times New Roman" w:hAnsi="Times New Roman" w:cs="Times New Roman"/>
-        </w:rPr>
-        <w:t>Request structured evaluation.</w:t>
-      </w:r>
-    </w:p>
-    <w:p>
-      <w:pPr>
-        <w:numPr>
-          <w:ilvl w:val="0"/>
-          <w:numId w:val="20"/>
-        </w:numPr>
-        <w:jc w:val="both"/>
-        <w:rPr>
-          <w:rFonts w:ascii="Times New Roman" w:hAnsi="Times New Roman" w:cs="Times New Roman"/>
-        </w:rPr>
-      </w:pPr>
-      <w:r>
-        <w:rPr>
-          <w:rFonts w:ascii="Times New Roman" w:hAnsi="Times New Roman" w:cs="Times New Roman"/>
-        </w:rPr>
-        <w:t>Extract scores and reasoning.</w:t>
-      </w:r>
-    </w:p>
-    <w:p>
-      <w:pPr>
-        <w:numPr>
-          <w:ilvl w:val="0"/>
-          <w:numId w:val="20"/>
-        </w:numPr>
-        <w:jc w:val="both"/>
-        <w:rPr>
-          <w:rFonts w:ascii="Times New Roman" w:hAnsi="Times New Roman" w:cs="Times New Roman"/>
-        </w:rPr>
-      </w:pPr>
-      <w:r>
-        <w:rPr>
-          <w:rFonts w:ascii="Times New Roman" w:hAnsi="Times New Roman" w:cs="Times New Roman"/>
-        </w:rPr>
-        <w:t>Return results to the main application.</w:t>
-      </w:r>
-    </w:p>
-    <w:p>
-      <w:pPr>
-        <w:jc w:val="both"/>
-        <w:rPr>
-          <w:rFonts w:ascii="Times New Roman" w:hAnsi="Times New Roman" w:cs="Times New Roman"/>
-        </w:rPr>
-      </w:pPr>
-      <w:r>
-        <w:rPr>
-          <w:rFonts w:ascii="Times New Roman" w:hAnsi="Times New Roman" w:cs="Times New Roman"/>
-        </w:rPr>
-        <w:t>This module handles subjective assessments that require contextual understanding.</w:t>
-      </w:r>
-    </w:p>
-    <w:p>
-      <w:pPr>
-        <w:jc w:val="both"/>
-        <w:rPr>
-          <w:rFonts w:ascii="Times New Roman" w:hAnsi="Times New Roman" w:cs="Times New Roman"/>
-        </w:rPr>
-      </w:pPr>
+        <w:ind w:firstLine="720"/>
+        <w:jc w:val="both"/>
+        <w:rPr>
+          <w:rFonts w:ascii="Times New Roman" w:hAnsi="Times New Roman" w:cs="Times New Roman"/>
+        </w:rPr>
+      </w:pPr>
+      <w:r>
+        <w:rPr>
+          <w:rFonts w:ascii="Times New Roman" w:hAnsi="Times New Roman" w:cs="Times New Roman"/>
+        </w:rPr>
+        <w:t>1. Receive transcript.</w:t>
+      </w:r>
+    </w:p>
+    <w:p>
+      <w:pPr>
+        <w:ind w:firstLine="720"/>
+        <w:jc w:val="both"/>
+        <w:rPr>
+          <w:rFonts w:ascii="Times New Roman" w:hAnsi="Times New Roman" w:cs="Times New Roman"/>
+        </w:rPr>
+      </w:pPr>
+      <w:r>
+        <w:rPr>
+          <w:rFonts w:ascii="Times New Roman" w:hAnsi="Times New Roman" w:cs="Times New Roman"/>
+        </w:rPr>
+        <w:t>2. Send transcript to Llama 3.3 70B Versatile.</w:t>
+      </w:r>
+    </w:p>
+    <w:p>
+      <w:pPr>
+        <w:ind w:firstLine="720"/>
+        <w:jc w:val="both"/>
+        <w:rPr>
+          <w:rFonts w:ascii="Times New Roman" w:hAnsi="Times New Roman" w:cs="Times New Roman"/>
+        </w:rPr>
+      </w:pPr>
+      <w:r>
+        <w:rPr>
+          <w:rFonts w:ascii="Times New Roman" w:hAnsi="Times New Roman" w:cs="Times New Roman"/>
+        </w:rPr>
+        <w:t>3. Request structured JSON evaluation.</w:t>
+      </w:r>
+    </w:p>
+    <w:p>
+      <w:pPr>
+        <w:ind w:firstLine="720"/>
+        <w:jc w:val="both"/>
+        <w:rPr>
+          <w:rFonts w:ascii="Times New Roman" w:hAnsi="Times New Roman" w:cs="Times New Roman"/>
+        </w:rPr>
+      </w:pPr>
+      <w:r>
+        <w:rPr>
+          <w:rFonts w:ascii="Times New Roman" w:hAnsi="Times New Roman" w:cs="Times New Roman"/>
+        </w:rPr>
+        <w:t>4. Extract scores and reasoning.</w:t>
+      </w:r>
+    </w:p>
+    <w:p>
+      <w:pPr>
+        <w:ind w:firstLine="720"/>
+        <w:jc w:val="both"/>
+        <w:rPr>
+          <w:rFonts w:ascii="Times New Roman" w:hAnsi="Times New Roman" w:cs="Times New Roman"/>
+        </w:rPr>
+      </w:pPr>
+      <w:r>
+        <w:rPr>
+          <w:rFonts w:ascii="Times New Roman" w:hAnsi="Times New Roman" w:cs="Times New Roman"/>
+        </w:rPr>
+        <w:t>5. Return results to the main application.</w:t>
+      </w:r>
+    </w:p>
+    <w:p>
+      <w:pPr>
+        <w:jc w:val="both"/>
+        <w:rPr>
+          <w:rFonts w:ascii="Times New Roman" w:hAnsi="Times New Roman" w:cs="Times New Roman"/>
+        </w:rPr>
+      </w:pPr>
+      <w:r>
+        <w:rPr>
+          <w:rFonts w:ascii="Times New Roman" w:hAnsi="Times New Roman" w:cs="Times New Roman"/>
+        </w:rPr>
+        <w:t>This module handles subjective assessments that require contextual understanding and reasoning.</w:t>
+      </w:r>
     </w:p>
     <w:p>
       <w:pPr>
@@ -5576,14 +5746,6 @@
         <w:jc w:val="both"/>
         <w:rPr>
           <w:rFonts w:ascii="Times New Roman" w:hAnsi="Times New Roman" w:cs="Times New Roman"/>
-        </w:rPr>
-      </w:pPr>
-    </w:p>
-    <w:p>
-      <w:pPr>
-        <w:jc w:val="both"/>
-        <w:rPr>
-          <w:rFonts w:ascii="Times New Roman" w:hAnsi="Times New Roman" w:cs="Times New Roman"/>
           <w:b/>
           <w:bCs/>
           <w:sz w:val="28"/>
@@ -5600,6 +5762,16 @@
         </w:rPr>
         <w:t>Repository Structure</w:t>
       </w:r>
+      <w:r>
+        <w:rPr>
+          <w:rFonts w:ascii="Times New Roman" w:hAnsi="Times New Roman" w:cs="Times New Roman"/>
+          <w:b/>
+          <w:bCs/>
+          <w:sz w:val="28"/>
+          <w:szCs w:val="28"/>
+        </w:rPr>
+        <w:t>:</w:t>
+      </w:r>
     </w:p>
     <w:p>
       <w:pPr>
@@ -5738,8 +5910,16 @@
         <w:rPr>
           <w:rFonts w:ascii="Times New Roman" w:hAnsi="Times New Roman" w:cs="Times New Roman"/>
         </w:rPr>
-        <w:t>└── .env</w:t>
-      </w:r>
+        <w:t>└─</w:t>
+      </w:r>
+      <w:proofErr w:type="gramStart"/>
+      <w:r>
+        <w:rPr>
+          <w:rFonts w:ascii="Times New Roman" w:hAnsi="Times New Roman" w:cs="Times New Roman"/>
+        </w:rPr>
+        <w:t>─ .env</w:t>
+      </w:r>
+      <w:proofErr w:type="gramEnd"/>
     </w:p>
     <w:p>
       <w:pPr>
@@ -5754,6 +5934,18 @@
         </w:rPr>
         <w:t>The modular structure was chosen to separate responsibilities and improve maintainability.</w:t>
       </w:r>
+    </w:p>
+    <w:p>
+      <w:pPr>
+        <w:jc w:val="both"/>
+        <w:rPr>
+          <w:rFonts w:ascii="Times New Roman" w:hAnsi="Times New Roman" w:cs="Times New Roman"/>
+          <w:b/>
+          <w:bCs/>
+          <w:sz w:val="28"/>
+          <w:szCs w:val="28"/>
+        </w:rPr>
+      </w:pPr>
     </w:p>
     <w:p>
       <w:pPr>
@@ -6208,96 +6400,62 @@
     </w:p>
     <w:p>
       <w:pPr>
-        <w:jc w:val="both"/>
-        <w:rPr>
-          <w:rFonts w:ascii="Times New Roman" w:hAnsi="Times New Roman" w:cs="Times New Roman"/>
-          <w:b/>
-          <w:bCs/>
-          <w:sz w:val="28"/>
-          <w:szCs w:val="28"/>
-        </w:rPr>
-      </w:pPr>
-      <w:r>
-        <w:rPr>
-          <w:rFonts w:ascii="Times New Roman" w:hAnsi="Times New Roman" w:cs="Times New Roman"/>
-          <w:b/>
-          <w:bCs/>
-          <w:sz w:val="28"/>
-          <w:szCs w:val="28"/>
-        </w:rPr>
-        <w:t>Challenge 2: Gemini API Quotas</w:t>
-      </w:r>
-    </w:p>
-    <w:p>
-      <w:pPr>
-        <w:jc w:val="both"/>
-        <w:rPr>
-          <w:rFonts w:ascii="Times New Roman" w:hAnsi="Times New Roman" w:cs="Times New Roman"/>
-          <w:b/>
-          <w:bCs/>
-          <w:sz w:val="28"/>
-          <w:szCs w:val="28"/>
-        </w:rPr>
-      </w:pPr>
-      <w:r>
-        <w:rPr>
-          <w:rFonts w:ascii="Times New Roman" w:hAnsi="Times New Roman" w:cs="Times New Roman"/>
-          <w:b/>
-          <w:bCs/>
-          <w:sz w:val="28"/>
-          <w:szCs w:val="28"/>
+        <w:pStyle w:val="NormalWeb"/>
+        <w:rPr>
+          <w:b/>
+          <w:bCs/>
+          <w:sz w:val="28"/>
+          <w:szCs w:val="28"/>
+        </w:rPr>
+      </w:pPr>
+      <w:r>
+        <w:rPr>
+          <w:b/>
+          <w:bCs/>
+          <w:sz w:val="28"/>
+          <w:szCs w:val="28"/>
+        </w:rPr>
+        <w:t>Challenge 2: LLM API Rate Limits</w:t>
+      </w:r>
+    </w:p>
+    <w:p>
+      <w:pPr>
+        <w:pStyle w:val="NormalWeb"/>
+        <w:rPr>
+          <w:b/>
+          <w:bCs/>
+          <w:sz w:val="32"/>
+          <w:szCs w:val="32"/>
+        </w:rPr>
+      </w:pPr>
+      <w:r>
+        <w:rPr>
+          <w:b/>
+          <w:bCs/>
+          <w:sz w:val="32"/>
+          <w:szCs w:val="32"/>
         </w:rPr>
         <w:t>Problem</w:t>
       </w:r>
     </w:p>
     <w:p>
       <w:pPr>
-        <w:jc w:val="both"/>
-        <w:rPr>
-          <w:rFonts w:ascii="Times New Roman" w:hAnsi="Times New Roman" w:cs="Times New Roman"/>
-        </w:rPr>
-      </w:pPr>
-      <w:r>
-        <w:rPr>
-          <w:rFonts w:ascii="Times New Roman" w:hAnsi="Times New Roman" w:cs="Times New Roman"/>
-        </w:rPr>
-        <w:t>During testing, free-tier Gemini limits occasionally restricted the number of transcript evaluations that could be performed within a given period.</w:t>
-      </w:r>
-      <w:r>
-        <w:rPr>
-          <w:rFonts w:ascii="Times New Roman" w:hAnsi="Times New Roman" w:cs="Times New Roman"/>
-        </w:rPr>
-        <w:t xml:space="preserve"> Gemini API key provides around 1 Million tokens for input and around 65 thousand for output</w:t>
-      </w:r>
-    </w:p>
-    <w:p>
-      <w:pPr>
-        <w:jc w:val="both"/>
-        <w:rPr>
-          <w:rFonts w:ascii="Times New Roman" w:hAnsi="Times New Roman" w:cs="Times New Roman"/>
-        </w:rPr>
-      </w:pPr>
-      <w:r>
-        <w:rPr>
-          <w:rFonts w:ascii="Times New Roman" w:hAnsi="Times New Roman" w:cs="Times New Roman"/>
-        </w:rPr>
-        <w:t>Gemini API free tier includes only 15 uploads ( prompts ) per minute across API key in the same project</w:t>
-      </w:r>
-    </w:p>
-    <w:p>
-      <w:pPr>
-        <w:jc w:val="both"/>
-        <w:rPr>
-          <w:rFonts w:ascii="Times New Roman" w:hAnsi="Times New Roman" w:cs="Times New Roman"/>
-          <w:b/>
-          <w:bCs/>
-          <w:sz w:val="28"/>
-          <w:szCs w:val="28"/>
-        </w:rPr>
-      </w:pPr>
-      <w:r>
-        <w:rPr>
-          <w:rFonts w:ascii="Times New Roman" w:hAnsi="Times New Roman" w:cs="Times New Roman"/>
+        <w:pStyle w:val="NormalWeb"/>
+      </w:pPr>
+      <w:r>
+        <w:t>The project relies on a cloud-hosted Large Language Model to evaluate clarity, technical accuracy, and professionalism. During testing, API rate limits needed to be considered to ensure reliable operation and scalability.</w:t>
+      </w:r>
+    </w:p>
+    <w:p>
+      <w:pPr>
+        <w:pStyle w:val="NormalWeb"/>
+        <w:rPr>
+          <w:b/>
+          <w:bCs/>
+        </w:rPr>
+      </w:pPr>
+      <w:r>
+        <w:rPr>
           <w:b/>
           <w:bCs/>
           <w:sz w:val="28"/>
@@ -6308,72 +6466,108 @@
     </w:p>
     <w:p>
       <w:pPr>
-        <w:numPr>
-          <w:ilvl w:val="0"/>
-          <w:numId w:val="27"/>
-        </w:numPr>
-        <w:jc w:val="both"/>
-        <w:rPr>
-          <w:rFonts w:ascii="Times New Roman" w:hAnsi="Times New Roman" w:cs="Times New Roman"/>
-        </w:rPr>
-      </w:pPr>
-      <w:r>
-        <w:rPr>
-          <w:rFonts w:ascii="Times New Roman" w:hAnsi="Times New Roman" w:cs="Times New Roman"/>
-        </w:rPr>
-        <w:t>Interrupted testing sessions</w:t>
-      </w:r>
-    </w:p>
-    <w:p>
-      <w:pPr>
-        <w:numPr>
-          <w:ilvl w:val="0"/>
-          <w:numId w:val="27"/>
-        </w:numPr>
-        <w:jc w:val="both"/>
-        <w:rPr>
-          <w:rFonts w:ascii="Times New Roman" w:hAnsi="Times New Roman" w:cs="Times New Roman"/>
-        </w:rPr>
-      </w:pPr>
-      <w:r>
-        <w:rPr>
-          <w:rFonts w:ascii="Times New Roman" w:hAnsi="Times New Roman" w:cs="Times New Roman"/>
-        </w:rPr>
-        <w:t>Reduced development efficiency</w:t>
-      </w:r>
-    </w:p>
-    <w:p>
-      <w:pPr>
-        <w:numPr>
-          <w:ilvl w:val="0"/>
-          <w:numId w:val="27"/>
-        </w:numPr>
-        <w:jc w:val="both"/>
-        <w:rPr>
-          <w:rFonts w:ascii="Times New Roman" w:hAnsi="Times New Roman" w:cs="Times New Roman"/>
-        </w:rPr>
-      </w:pPr>
-      <w:r>
-        <w:rPr>
-          <w:rFonts w:ascii="Times New Roman" w:hAnsi="Times New Roman" w:cs="Times New Roman"/>
-        </w:rPr>
-        <w:t>Highlighted scalability concerns</w:t>
-      </w:r>
-    </w:p>
-    <w:p>
-      <w:pPr>
-        <w:jc w:val="both"/>
-        <w:rPr>
-          <w:rFonts w:ascii="Times New Roman" w:hAnsi="Times New Roman" w:cs="Times New Roman"/>
-          <w:b/>
-          <w:bCs/>
-          <w:sz w:val="28"/>
-          <w:szCs w:val="28"/>
-        </w:rPr>
-      </w:pPr>
-      <w:r>
-        <w:rPr>
-          <w:rFonts w:ascii="Times New Roman" w:hAnsi="Times New Roman" w:cs="Times New Roman"/>
+        <w:pStyle w:val="NormalWeb"/>
+      </w:pPr>
+      <w:r>
+        <w:t>• Limited number of evaluations per minute.</w:t>
+      </w:r>
+      <w:r>
+        <w:t xml:space="preserve"> </w:t>
+      </w:r>
+      <w:proofErr w:type="gramStart"/>
+      <w:r>
+        <w:t>( 30</w:t>
+      </w:r>
+      <w:proofErr w:type="gramEnd"/>
+      <w:r>
+        <w:t xml:space="preserve"> R</w:t>
+      </w:r>
+      <w:r>
+        <w:t>PM, 1K RPD,</w:t>
+      </w:r>
+      <w:r>
+        <w:t xml:space="preserve"> 12K TPM, 100K </w:t>
+      </w:r>
+      <w:proofErr w:type="gramStart"/>
+      <w:r>
+        <w:t>TPD )</w:t>
+      </w:r>
+      <w:proofErr w:type="gramEnd"/>
+      <w:r>
+        <w:br/>
+        <w:t>• Potential delays during heavy testing.</w:t>
+      </w:r>
+      <w:r>
+        <w:br/>
+        <w:t>• Need to optimize token usage.</w:t>
+      </w:r>
+    </w:p>
+    <w:p>
+      <w:pPr>
+        <w:pStyle w:val="NormalWeb"/>
+      </w:pPr>
+      <w:r>
+        <w:t>*RPM – Request per Minute</w:t>
+      </w:r>
+      <w:r>
+        <w:tab/>
+      </w:r>
+      <w:r>
+        <w:tab/>
+      </w:r>
+      <w:r>
+        <w:tab/>
+      </w:r>
+      <w:r>
+        <w:tab/>
+      </w:r>
+      <w:r>
+        <w:tab/>
+        <w:t>*</w:t>
+      </w:r>
+      <w:r>
+        <w:t>TPM – Tokens Per Minute</w:t>
+      </w:r>
+      <w:r>
+        <w:tab/>
+      </w:r>
+    </w:p>
+    <w:p>
+      <w:pPr>
+        <w:pStyle w:val="NormalWeb"/>
+      </w:pPr>
+      <w:r>
+        <w:t>*RPD – Request Per Day</w:t>
+      </w:r>
+      <w:r>
+        <w:tab/>
+      </w:r>
+      <w:r>
+        <w:tab/>
+      </w:r>
+      <w:r>
+        <w:tab/>
+      </w:r>
+      <w:r>
+        <w:tab/>
+      </w:r>
+      <w:r>
+        <w:tab/>
+        <w:t>*TPD – Token Per Day</w:t>
+      </w:r>
+    </w:p>
+    <w:p>
+      <w:pPr>
+        <w:pStyle w:val="NormalWeb"/>
+        <w:rPr>
+          <w:b/>
+          <w:bCs/>
+          <w:sz w:val="28"/>
+          <w:szCs w:val="28"/>
+        </w:rPr>
+      </w:pPr>
+      <w:r>
+        <w:rPr>
           <w:b/>
           <w:bCs/>
           <w:sz w:val="28"/>
@@ -6381,28 +6575,39 @@
         </w:rPr>
         <w:t>Resolution</w:t>
       </w:r>
-    </w:p>
-    <w:p>
-      <w:pPr>
-        <w:jc w:val="both"/>
-        <w:rPr>
-          <w:rFonts w:ascii="Times New Roman" w:hAnsi="Times New Roman" w:cs="Times New Roman"/>
-        </w:rPr>
-      </w:pPr>
-      <w:r>
-        <w:rPr>
-          <w:rFonts w:ascii="Times New Roman" w:hAnsi="Times New Roman" w:cs="Times New Roman"/>
-        </w:rPr>
-        <w:t>The architecture was designed to minimize LLM calls by evaluating objective metrics locally and reserving Gemini only for tasks requiring contextual reasoning.</w:t>
-      </w:r>
-    </w:p>
-    <w:p>
-      <w:pPr>
-        <w:jc w:val="both"/>
-        <w:rPr>
-          <w:rFonts w:ascii="Times New Roman" w:hAnsi="Times New Roman" w:cs="Times New Roman"/>
-        </w:rPr>
-      </w:pPr>
+      <w:r>
+        <w:rPr>
+          <w:b/>
+          <w:bCs/>
+          <w:sz w:val="28"/>
+          <w:szCs w:val="28"/>
+        </w:rPr>
+        <w:t>:</w:t>
+      </w:r>
+    </w:p>
+    <w:p>
+      <w:pPr>
+        <w:pStyle w:val="NormalWeb"/>
+      </w:pPr>
+      <w:r>
+        <w:t>The project adopted a hybrid evaluation architecture. Objective metrics such as grammar and vocabulary are evaluated locally, while only subjective metrics are sent to the LLM. This significantly reduces token consumption and allows efficient use of available API quotas.</w:t>
+      </w:r>
+    </w:p>
+    <w:p>
+      <w:pPr>
+        <w:pStyle w:val="NormalWeb"/>
+      </w:pPr>
+      <w:r>
+        <w:t xml:space="preserve">The final implementation uses </w:t>
+      </w:r>
+      <w:proofErr w:type="spellStart"/>
+      <w:r>
+        <w:t>Groq</w:t>
+      </w:r>
+      <w:proofErr w:type="spellEnd"/>
+      <w:r>
+        <w:t>-hosted Llama 3.3 70B Versatile, which provides higher request throughput while maintaining strong evaluation quality.</w:t>
+      </w:r>
     </w:p>
     <w:p>
       <w:pPr>
@@ -6583,6 +6788,30 @@
           <w:szCs w:val="28"/>
         </w:rPr>
       </w:pPr>
+    </w:p>
+    <w:p>
+      <w:pPr>
+        <w:jc w:val="both"/>
+        <w:rPr>
+          <w:rFonts w:ascii="Times New Roman" w:hAnsi="Times New Roman" w:cs="Times New Roman"/>
+          <w:b/>
+          <w:bCs/>
+          <w:sz w:val="28"/>
+          <w:szCs w:val="28"/>
+        </w:rPr>
+      </w:pPr>
+    </w:p>
+    <w:p>
+      <w:pPr>
+        <w:jc w:val="both"/>
+        <w:rPr>
+          <w:rFonts w:ascii="Times New Roman" w:hAnsi="Times New Roman" w:cs="Times New Roman"/>
+          <w:b/>
+          <w:bCs/>
+          <w:sz w:val="28"/>
+          <w:szCs w:val="28"/>
+        </w:rPr>
+      </w:pPr>
       <w:r>
         <w:rPr>
           <w:rFonts w:ascii="Times New Roman" w:hAnsi="Times New Roman" w:cs="Times New Roman"/>
@@ -6627,7 +6856,6 @@
         <w:rPr>
           <w:rFonts w:ascii="Times New Roman" w:hAnsi="Times New Roman" w:cs="Times New Roman"/>
         </w:rPr>
-        <w:lastRenderedPageBreak/>
         <w:t>Traditional lexical diversity measures such as Type Token Ratio (TTR) are highly sensitive to transcript length.</w:t>
       </w:r>
     </w:p>
@@ -6822,12 +7050,14 @@
           <w:rFonts w:ascii="Times New Roman" w:hAnsi="Times New Roman" w:cs="Times New Roman"/>
         </w:rPr>
       </w:pPr>
+      <w:proofErr w:type="spellStart"/>
       <w:r>
         <w:rPr>
           <w:rFonts w:ascii="Times New Roman" w:hAnsi="Times New Roman" w:cs="Times New Roman"/>
         </w:rPr>
         <w:t>FFmpeg</w:t>
       </w:r>
+      <w:proofErr w:type="spellEnd"/>
     </w:p>
     <w:p>
       <w:pPr>
@@ -6934,20 +7164,43 @@
         <w:jc w:val="both"/>
         <w:rPr>
           <w:rFonts w:ascii="Times New Roman" w:hAnsi="Times New Roman" w:cs="Times New Roman"/>
-          <w:b/>
-          <w:bCs/>
-          <w:sz w:val="28"/>
-          <w:szCs w:val="28"/>
-        </w:rPr>
-      </w:pPr>
-      <w:r>
-        <w:rPr>
-          <w:rFonts w:ascii="Times New Roman" w:hAnsi="Times New Roman" w:cs="Times New Roman"/>
-          <w:b/>
-          <w:bCs/>
-          <w:sz w:val="28"/>
-          <w:szCs w:val="28"/>
-        </w:rPr>
+          <w:sz w:val="28"/>
+          <w:szCs w:val="28"/>
+        </w:rPr>
+      </w:pPr>
+    </w:p>
+    <w:p>
+      <w:pPr>
+        <w:jc w:val="both"/>
+        <w:rPr>
+          <w:rFonts w:ascii="Times New Roman" w:hAnsi="Times New Roman" w:cs="Times New Roman"/>
+          <w:b/>
+          <w:bCs/>
+          <w:sz w:val="28"/>
+          <w:szCs w:val="28"/>
+        </w:rPr>
+      </w:pPr>
+    </w:p>
+    <w:p>
+      <w:pPr>
+        <w:jc w:val="both"/>
+        <w:rPr>
+          <w:rFonts w:ascii="Times New Roman" w:hAnsi="Times New Roman" w:cs="Times New Roman"/>
+          <w:b/>
+          <w:bCs/>
+          <w:sz w:val="28"/>
+          <w:szCs w:val="28"/>
+        </w:rPr>
+      </w:pPr>
+      <w:r>
+        <w:rPr>
+          <w:rFonts w:ascii="Times New Roman" w:hAnsi="Times New Roman" w:cs="Times New Roman"/>
+          <w:b/>
+          <w:bCs/>
+          <w:sz w:val="28"/>
+          <w:szCs w:val="28"/>
+        </w:rPr>
+        <w:lastRenderedPageBreak/>
         <w:t>Challenge 6: Cross-Machine Deployment</w:t>
       </w:r>
     </w:p>
@@ -7052,11 +7305,19 @@
           <w:rFonts w:ascii="Times New Roman" w:hAnsi="Times New Roman" w:cs="Times New Roman"/>
         </w:rPr>
       </w:pPr>
-      <w:r>
-        <w:rPr>
-          <w:rFonts w:ascii="Times New Roman" w:hAnsi="Times New Roman" w:cs="Times New Roman"/>
-        </w:rPr>
-        <w:t>FFmpeg not installed</w:t>
+      <w:proofErr w:type="spellStart"/>
+      <w:r>
+        <w:rPr>
+          <w:rFonts w:ascii="Times New Roman" w:hAnsi="Times New Roman" w:cs="Times New Roman"/>
+        </w:rPr>
+        <w:t>FFmpeg</w:t>
+      </w:r>
+      <w:proofErr w:type="spellEnd"/>
+      <w:r>
+        <w:rPr>
+          <w:rFonts w:ascii="Times New Roman" w:hAnsi="Times New Roman" w:cs="Times New Roman"/>
+        </w:rPr>
+        <w:t xml:space="preserve"> not installed</w:t>
       </w:r>
     </w:p>
     <w:p>
@@ -7074,7 +7335,6 @@
         <w:rPr>
           <w:rFonts w:ascii="Times New Roman" w:hAnsi="Times New Roman" w:cs="Times New Roman"/>
         </w:rPr>
-        <w:lastRenderedPageBreak/>
         <w:t>Missing environment variables</w:t>
       </w:r>
     </w:p>
@@ -7261,7 +7521,21 @@
         <w:rPr>
           <w:rFonts w:ascii="Times New Roman" w:hAnsi="Times New Roman" w:cs="Times New Roman"/>
         </w:rPr>
-        <w:t>A dedicated .env configuration process was documented and verified during deployment testing.</w:t>
+        <w:t xml:space="preserve">A </w:t>
+      </w:r>
+      <w:proofErr w:type="gramStart"/>
+      <w:r>
+        <w:rPr>
+          <w:rFonts w:ascii="Times New Roman" w:hAnsi="Times New Roman" w:cs="Times New Roman"/>
+        </w:rPr>
+        <w:t>dedicated .env</w:t>
+      </w:r>
+      <w:proofErr w:type="gramEnd"/>
+      <w:r>
+        <w:rPr>
+          <w:rFonts w:ascii="Times New Roman" w:hAnsi="Times New Roman" w:cs="Times New Roman"/>
+        </w:rPr>
+        <w:t xml:space="preserve"> configuration process was documented and verified during deployment testing.</w:t>
       </w:r>
     </w:p>
     <w:p>
@@ -7453,12 +7727,25 @@
         <w:rPr>
           <w:rFonts w:ascii="Times New Roman" w:hAnsi="Times New Roman" w:cs="Times New Roman"/>
         </w:rPr>
+        <w:t xml:space="preserve"> </w:t>
+      </w:r>
+      <w:r>
+        <w:rPr>
+          <w:rFonts w:ascii="Times New Roman" w:hAnsi="Times New Roman" w:cs="Times New Roman"/>
+        </w:rPr>
+        <w:tab/>
+      </w:r>
+      <w:r>
+        <w:rPr>
+          <w:rFonts w:ascii="Times New Roman" w:hAnsi="Times New Roman" w:cs="Times New Roman"/>
+        </w:rPr>
         <w:t>- Local LLM integration</w:t>
       </w:r>
     </w:p>
     <w:p>
       <w:pPr>
         <w:spacing w:line="240" w:lineRule="auto"/>
+        <w:ind w:firstLine="720"/>
         <w:jc w:val="both"/>
         <w:rPr>
           <w:rFonts w:ascii="Times New Roman" w:hAnsi="Times New Roman" w:cs="Times New Roman"/>
@@ -7474,6 +7761,7 @@
     <w:p>
       <w:pPr>
         <w:spacing w:line="240" w:lineRule="auto"/>
+        <w:ind w:firstLine="720"/>
         <w:jc w:val="both"/>
         <w:rPr>
           <w:rFonts w:ascii="Times New Roman" w:hAnsi="Times New Roman" w:cs="Times New Roman"/>
@@ -7489,6 +7777,7 @@
     <w:p>
       <w:pPr>
         <w:spacing w:line="240" w:lineRule="auto"/>
+        <w:ind w:firstLine="720"/>
         <w:jc w:val="both"/>
         <w:rPr>
           <w:rFonts w:ascii="Times New Roman" w:hAnsi="Times New Roman" w:cs="Times New Roman"/>
@@ -7504,6 +7793,7 @@
     <w:p>
       <w:pPr>
         <w:spacing w:line="240" w:lineRule="auto"/>
+        <w:ind w:firstLine="720"/>
         <w:jc w:val="both"/>
         <w:rPr>
           <w:rFonts w:ascii="Times New Roman" w:hAnsi="Times New Roman" w:cs="Times New Roman"/>
@@ -7519,22 +7809,23 @@
     <w:p>
       <w:pPr>
         <w:spacing w:line="240" w:lineRule="auto"/>
-        <w:jc w:val="both"/>
-        <w:rPr>
-          <w:rFonts w:ascii="Times New Roman" w:hAnsi="Times New Roman" w:cs="Times New Roman"/>
-        </w:rPr>
-      </w:pPr>
-      <w:r>
-        <w:rPr>
-          <w:rFonts w:ascii="Times New Roman" w:hAnsi="Times New Roman" w:cs="Times New Roman"/>
-        </w:rPr>
-        <w:lastRenderedPageBreak/>
+        <w:ind w:firstLine="720"/>
+        <w:jc w:val="both"/>
+        <w:rPr>
+          <w:rFonts w:ascii="Times New Roman" w:hAnsi="Times New Roman" w:cs="Times New Roman"/>
+        </w:rPr>
+      </w:pPr>
+      <w:r>
+        <w:rPr>
+          <w:rFonts w:ascii="Times New Roman" w:hAnsi="Times New Roman" w:cs="Times New Roman"/>
+        </w:rPr>
         <w:t>- Cloud deployment</w:t>
       </w:r>
     </w:p>
     <w:p>
       <w:pPr>
         <w:spacing w:line="240" w:lineRule="auto"/>
+        <w:ind w:firstLine="720"/>
         <w:jc w:val="both"/>
         <w:rPr>
           <w:rFonts w:ascii="Times New Roman" w:hAnsi="Times New Roman" w:cs="Times New Roman"/>
@@ -7573,7 +7864,7 @@
         </w:rPr>
         <w:lastRenderedPageBreak/>
         <w:drawing>
-          <wp:anchor distT="0" distB="0" distL="114300" distR="114300" simplePos="0" relativeHeight="251661312" behindDoc="0" locked="0" layoutInCell="1" allowOverlap="1" wp14:anchorId="2237E27C" wp14:editId="6A8AA5F0">
+          <wp:anchor distT="0" distB="0" distL="114300" distR="114300" simplePos="0" relativeHeight="251661312" behindDoc="0" locked="0" layoutInCell="1" allowOverlap="1" wp14:anchorId="2237E27C" wp14:editId="6BDBED65">
             <wp:simplePos x="0" y="0"/>
             <wp:positionH relativeFrom="margin">
               <wp:posOffset>-596900</wp:posOffset>
@@ -7695,7 +7986,7 @@
           <w:noProof/>
         </w:rPr>
         <w:drawing>
-          <wp:anchor distT="0" distB="0" distL="114300" distR="114300" simplePos="0" relativeHeight="251659264" behindDoc="0" locked="0" layoutInCell="1" allowOverlap="1" wp14:anchorId="1B74AD8E" wp14:editId="50B27DA3">
+          <wp:anchor distT="0" distB="0" distL="114300" distR="114300" simplePos="0" relativeHeight="251659264" behindDoc="0" locked="0" layoutInCell="1" allowOverlap="1" wp14:anchorId="1B74AD8E" wp14:editId="726A1CB3">
             <wp:simplePos x="0" y="0"/>
             <wp:positionH relativeFrom="margin">
               <wp:posOffset>-377466</wp:posOffset>
@@ -7758,39 +8049,18 @@
           <w:sz w:val="28"/>
           <w:szCs w:val="28"/>
         </w:rPr>
-        <w:t>OUTPUT</w:t>
-      </w:r>
-    </w:p>
-    <w:p>
-      <w:pPr>
-        <w:jc w:val="both"/>
-        <w:rPr>
-          <w:rFonts w:ascii="Times New Roman" w:hAnsi="Times New Roman" w:cs="Times New Roman"/>
-        </w:rPr>
-      </w:pPr>
-    </w:p>
-    <w:p>
-      <w:pPr>
-        <w:jc w:val="both"/>
-        <w:rPr>
-          <w:rFonts w:ascii="Times New Roman" w:hAnsi="Times New Roman" w:cs="Times New Roman"/>
-        </w:rPr>
-      </w:pPr>
-    </w:p>
-    <w:p>
-      <w:pPr>
-        <w:jc w:val="both"/>
-        <w:rPr>
-          <w:rFonts w:ascii="Times New Roman" w:hAnsi="Times New Roman" w:cs="Times New Roman"/>
-        </w:rPr>
-      </w:pPr>
-    </w:p>
-    <w:p>
-      <w:pPr>
-        <w:rPr>
-          <w:rFonts w:ascii="Times New Roman" w:hAnsi="Times New Roman" w:cs="Times New Roman"/>
-        </w:rPr>
-      </w:pPr>
+        <w:t>OUTPU</w:t>
+      </w:r>
+      <w:r>
+        <w:rPr>
+          <w:rFonts w:ascii="Times New Roman" w:hAnsi="Times New Roman" w:cs="Times New Roman"/>
+          <w:b/>
+          <w:bCs/>
+          <w:sz w:val="28"/>
+          <w:szCs w:val="28"/>
+        </w:rPr>
+        <w:t>T:</w:t>
+      </w:r>
     </w:p>
     <w:sectPr>
       <w:pgSz w:w="11906" w:h="16838"/>
@@ -12768,7 +13038,6 @@
   <w:style w:type="character" w:default="1" w:styleId="DefaultParagraphFont">
     <w:name w:val="Default Paragraph Font"/>
     <w:uiPriority w:val="1"/>
-    <w:semiHidden/>
     <w:unhideWhenUsed/>
   </w:style>
   <w:style w:type="table" w:default="1" w:styleId="TableNormal">
@@ -13126,6 +13395,23 @@
     <w:uiPriority w:val="99"/>
     <w:rsid w:val="00DC4547"/>
   </w:style>
+  <w:style w:type="paragraph" w:styleId="NormalWeb">
+    <w:name w:val="Normal (Web)"/>
+    <w:basedOn w:val="Normal"/>
+    <w:uiPriority w:val="99"/>
+    <w:semiHidden/>
+    <w:unhideWhenUsed/>
+    <w:rsid w:val="00404F09"/>
+    <w:pPr>
+      <w:spacing w:before="100" w:beforeAutospacing="1" w:after="100" w:afterAutospacing="1" w:line="240" w:lineRule="auto"/>
+    </w:pPr>
+    <w:rPr>
+      <w:rFonts w:ascii="Times New Roman" w:eastAsia="Times New Roman" w:hAnsi="Times New Roman" w:cs="Times New Roman"/>
+      <w:kern w:val="0"/>
+      <w:lang w:eastAsia="en-IN"/>
+      <w14:ligatures w14:val="none"/>
+    </w:rPr>
+  </w:style>
 </w:styles>
 </file>
 

</xml_diff>

<commit_message>
Modified Doc for Llama 4
</commit_message>
<xml_diff>
--- a/Project Overview.docx
+++ b/Project Overview.docx
@@ -378,7 +378,25 @@
         <w:rPr>
           <w:rFonts w:ascii="Times New Roman" w:hAnsi="Times New Roman" w:cs="Times New Roman"/>
         </w:rPr>
-        <w:t>-hosted Llama 3.3 70B Versatile to evaluate clarity, technical accuracy, and professionalism.</w:t>
+        <w:t>-hosted</w:t>
+      </w:r>
+      <w:r>
+        <w:rPr>
+          <w:rFonts w:ascii="Times New Roman" w:hAnsi="Times New Roman" w:cs="Times New Roman"/>
+        </w:rPr>
+        <w:t xml:space="preserve"> L</w:t>
+      </w:r>
+      <w:r>
+        <w:rPr>
+          <w:rFonts w:ascii="Times New Roman" w:hAnsi="Times New Roman" w:cs="Times New Roman"/>
+        </w:rPr>
+        <w:t>lama-4-scout-17b-16e-instruct</w:t>
+      </w:r>
+      <w:r>
+        <w:rPr>
+          <w:rFonts w:ascii="Times New Roman" w:hAnsi="Times New Roman" w:cs="Times New Roman"/>
+        </w:rPr>
+        <w:t xml:space="preserve"> to evaluate clarity, technical accuracy, and professionalism.</w:t>
       </w:r>
     </w:p>
     <w:p>
@@ -1321,7 +1339,7 @@
         <w:rPr>
           <w:rFonts w:ascii="Times New Roman" w:hAnsi="Times New Roman" w:cs="Times New Roman"/>
         </w:rPr>
-        <w:t xml:space="preserve">5. Clarity, technical accuracy, and professionalism are evaluated using </w:t>
+        <w:t xml:space="preserve">Clarity, technical accuracy, and professionalism are evaluated using </w:t>
       </w:r>
       <w:proofErr w:type="spellStart"/>
       <w:r>
@@ -1335,7 +1353,19 @@
         <w:rPr>
           <w:rFonts w:ascii="Times New Roman" w:hAnsi="Times New Roman" w:cs="Times New Roman"/>
         </w:rPr>
-        <w:t>-hosted Llama 3.3 70B Versatile.</w:t>
+        <w:t xml:space="preserve">-hosted </w:t>
+      </w:r>
+      <w:r>
+        <w:rPr>
+          <w:rFonts w:ascii="Times New Roman" w:hAnsi="Times New Roman" w:cs="Times New Roman"/>
+        </w:rPr>
+        <w:t>L</w:t>
+      </w:r>
+      <w:r>
+        <w:rPr>
+          <w:rFonts w:ascii="Times New Roman" w:hAnsi="Times New Roman" w:cs="Times New Roman"/>
+        </w:rPr>
+        <w:t>lama-4-scout-17b-16e-instruct</w:t>
       </w:r>
     </w:p>
     <w:p>
@@ -1422,10 +1452,10 @@
           <w:bCs/>
         </w:rPr>
         <w:drawing>
-          <wp:inline distT="0" distB="0" distL="0" distR="0" wp14:anchorId="6E06995A" wp14:editId="6A432474">
-            <wp:extent cx="5731510" cy="3079750"/>
-            <wp:effectExtent l="0" t="0" r="2540" b="6350"/>
-            <wp:docPr id="1396830166" name="Picture 1"/>
+          <wp:inline distT="0" distB="0" distL="0" distR="0" wp14:anchorId="7C1DA7BE" wp14:editId="02726CE6">
+            <wp:extent cx="5731510" cy="2871470"/>
+            <wp:effectExtent l="0" t="0" r="2540" b="5080"/>
+            <wp:docPr id="772568525" name="Picture 1"/>
             <wp:cNvGraphicFramePr>
               <a:graphicFrameLocks xmlns:a="http://schemas.openxmlformats.org/drawingml/2006/main" noChangeAspect="1"/>
             </wp:cNvGraphicFramePr>
@@ -1433,7 +1463,7 @@
               <a:graphicData uri="http://schemas.openxmlformats.org/drawingml/2006/picture">
                 <pic:pic xmlns:pic="http://schemas.openxmlformats.org/drawingml/2006/picture">
                   <pic:nvPicPr>
-                    <pic:cNvPr id="1396830166" name=""/>
+                    <pic:cNvPr id="772568525" name=""/>
                     <pic:cNvPicPr/>
                   </pic:nvPicPr>
                   <pic:blipFill>
@@ -1445,7 +1475,7 @@
                   <pic:spPr>
                     <a:xfrm>
                       <a:off x="0" y="0"/>
-                      <a:ext cx="5731510" cy="3079750"/>
+                      <a:ext cx="5731510" cy="2871470"/>
                     </a:xfrm>
                     <a:prstGeom prst="rect">
                       <a:avLst/>
@@ -1651,6 +1681,7 @@
           <w:sz w:val="28"/>
           <w:szCs w:val="28"/>
         </w:rPr>
+        <w:lastRenderedPageBreak/>
         <w:t>AI Evaluation Layer</w:t>
       </w:r>
     </w:p>
@@ -1665,7 +1696,31 @@
         <w:rPr>
           <w:rFonts w:ascii="Times New Roman" w:hAnsi="Times New Roman" w:cs="Times New Roman"/>
         </w:rPr>
-        <w:t xml:space="preserve">The AI evaluation layer uses Meta's Llama 3.3 70B Versatile model through the </w:t>
+        <w:t>The AI evaluation layer uses</w:t>
+      </w:r>
+      <w:r>
+        <w:rPr>
+          <w:rFonts w:ascii="Times New Roman" w:hAnsi="Times New Roman" w:cs="Times New Roman"/>
+        </w:rPr>
+        <w:t xml:space="preserve"> L</w:t>
+      </w:r>
+      <w:r>
+        <w:rPr>
+          <w:rFonts w:ascii="Times New Roman" w:hAnsi="Times New Roman" w:cs="Times New Roman"/>
+        </w:rPr>
+        <w:t>lama-4-scout-17b-16e-instruct</w:t>
+      </w:r>
+      <w:r>
+        <w:rPr>
+          <w:rFonts w:ascii="Times New Roman" w:hAnsi="Times New Roman" w:cs="Times New Roman"/>
+        </w:rPr>
+        <w:t xml:space="preserve"> </w:t>
+      </w:r>
+      <w:r>
+        <w:rPr>
+          <w:rFonts w:ascii="Times New Roman" w:hAnsi="Times New Roman" w:cs="Times New Roman"/>
+        </w:rPr>
+        <w:t xml:space="preserve">model through the </w:t>
       </w:r>
       <w:proofErr w:type="spellStart"/>
       <w:r>
@@ -2071,7 +2126,19 @@
         <w:rPr>
           <w:rFonts w:ascii="Times New Roman" w:hAnsi="Times New Roman" w:cs="Times New Roman"/>
         </w:rPr>
-        <w:t>By assigning objective metrics to local computation and subjective metrics to Llama 3.3 70B Versatile</w:t>
+        <w:t xml:space="preserve">By assigning objective metrics to local computation and subjective metrics to </w:t>
+      </w:r>
+      <w:r>
+        <w:rPr>
+          <w:rFonts w:ascii="Times New Roman" w:hAnsi="Times New Roman" w:cs="Times New Roman"/>
+        </w:rPr>
+        <w:t>L</w:t>
+      </w:r>
+      <w:r>
+        <w:rPr>
+          <w:rFonts w:ascii="Times New Roman" w:hAnsi="Times New Roman" w:cs="Times New Roman"/>
+        </w:rPr>
+        <w:t>lama-4-scout-17b-16e-instruct</w:t>
       </w:r>
       <w:r>
         <w:rPr>
@@ -2107,29 +2174,29 @@
           <w:sz w:val="28"/>
           <w:szCs w:val="28"/>
         </w:rPr>
+        <w:t>4. Design Decisions</w:t>
+      </w:r>
+    </w:p>
+    <w:p>
+      <w:pPr>
+        <w:jc w:val="both"/>
+        <w:rPr>
+          <w:rFonts w:ascii="Times New Roman" w:hAnsi="Times New Roman" w:cs="Times New Roman"/>
+          <w:b/>
+          <w:bCs/>
+          <w:sz w:val="28"/>
+          <w:szCs w:val="28"/>
+        </w:rPr>
+      </w:pPr>
+      <w:r>
+        <w:rPr>
+          <w:rFonts w:ascii="Times New Roman" w:hAnsi="Times New Roman" w:cs="Times New Roman"/>
+          <w:b/>
+          <w:bCs/>
+          <w:sz w:val="28"/>
+          <w:szCs w:val="28"/>
+        </w:rPr>
         <w:lastRenderedPageBreak/>
-        <w:t>4. Design Decisions</w:t>
-      </w:r>
-    </w:p>
-    <w:p>
-      <w:pPr>
-        <w:jc w:val="both"/>
-        <w:rPr>
-          <w:rFonts w:ascii="Times New Roman" w:hAnsi="Times New Roman" w:cs="Times New Roman"/>
-          <w:b/>
-          <w:bCs/>
-          <w:sz w:val="28"/>
-          <w:szCs w:val="28"/>
-        </w:rPr>
-      </w:pPr>
-      <w:r>
-        <w:rPr>
-          <w:rFonts w:ascii="Times New Roman" w:hAnsi="Times New Roman" w:cs="Times New Roman"/>
-          <w:b/>
-          <w:bCs/>
-          <w:sz w:val="28"/>
-          <w:szCs w:val="28"/>
-        </w:rPr>
         <w:t>Overview</w:t>
       </w:r>
     </w:p>
@@ -2474,7 +2541,19 @@
         <w:rPr>
           <w:rFonts w:ascii="Times New Roman" w:hAnsi="Times New Roman" w:cs="Times New Roman"/>
         </w:rPr>
-        <w:t>Llama 3.3 70B Evaluation:</w:t>
+        <w:t>L</w:t>
+      </w:r>
+      <w:r>
+        <w:rPr>
+          <w:rFonts w:ascii="Times New Roman" w:hAnsi="Times New Roman" w:cs="Times New Roman"/>
+        </w:rPr>
+        <w:t>lama-4-scout-17b-16e-instruct</w:t>
+      </w:r>
+      <w:r>
+        <w:rPr>
+          <w:rFonts w:ascii="Times New Roman" w:hAnsi="Times New Roman" w:cs="Times New Roman"/>
+        </w:rPr>
+        <w:t>:</w:t>
       </w:r>
     </w:p>
     <w:p>
@@ -3396,7 +3475,19 @@
         <w:rPr>
           <w:rFonts w:ascii="Times New Roman" w:hAnsi="Times New Roman" w:cs="Times New Roman"/>
         </w:rPr>
-        <w:t>Llama 3.3 70B Versatile.</w:t>
+        <w:t>L</w:t>
+      </w:r>
+      <w:r>
+        <w:rPr>
+          <w:rFonts w:ascii="Times New Roman" w:hAnsi="Times New Roman" w:cs="Times New Roman"/>
+        </w:rPr>
+        <w:t>lama-4-scout-17b-16e-instruct</w:t>
+      </w:r>
+      <w:r>
+        <w:rPr>
+          <w:rFonts w:ascii="Times New Roman" w:hAnsi="Times New Roman" w:cs="Times New Roman"/>
+        </w:rPr>
+        <w:t>.</w:t>
       </w:r>
     </w:p>
     <w:p>
@@ -3628,13 +3719,25 @@
         <w:rPr>
           <w:rFonts w:ascii="Times New Roman" w:hAnsi="Times New Roman" w:cs="Times New Roman"/>
         </w:rPr>
-        <w:t>Llama 3.3 70B Versatile</w:t>
-      </w:r>
-      <w:r>
-        <w:rPr>
-          <w:rFonts w:ascii="Times New Roman" w:hAnsi="Times New Roman" w:cs="Times New Roman"/>
-        </w:rPr>
-        <w:t xml:space="preserve"> to evaluate clarity.</w:t>
+        <w:t>L</w:t>
+      </w:r>
+      <w:r>
+        <w:rPr>
+          <w:rFonts w:ascii="Times New Roman" w:hAnsi="Times New Roman" w:cs="Times New Roman"/>
+        </w:rPr>
+        <w:t>lama-4-scout-17b-16e-instruct</w:t>
+      </w:r>
+      <w:r>
+        <w:rPr>
+          <w:rFonts w:ascii="Times New Roman" w:hAnsi="Times New Roman" w:cs="Times New Roman"/>
+        </w:rPr>
+        <w:t xml:space="preserve"> </w:t>
+      </w:r>
+      <w:r>
+        <w:rPr>
+          <w:rFonts w:ascii="Times New Roman" w:hAnsi="Times New Roman" w:cs="Times New Roman"/>
+        </w:rPr>
+        <w:t>to evaluate clarity.</w:t>
       </w:r>
     </w:p>
     <w:p>
@@ -3770,7 +3873,13 @@
         <w:rPr>
           <w:rFonts w:ascii="Times New Roman" w:hAnsi="Times New Roman" w:cs="Times New Roman"/>
         </w:rPr>
-        <w:t>Llama 3.3 70B Versatile.</w:t>
+        <w:t>L</w:t>
+      </w:r>
+      <w:r>
+        <w:rPr>
+          <w:rFonts w:ascii="Times New Roman" w:hAnsi="Times New Roman" w:cs="Times New Roman"/>
+        </w:rPr>
+        <w:t>lama-4-scout-17b-16e-instruct</w:t>
       </w:r>
     </w:p>
     <w:p>
@@ -4072,7 +4181,7 @@
       </w:tblPr>
       <w:tblGrid>
         <w:gridCol w:w="2284"/>
-        <w:gridCol w:w="3570"/>
+        <w:gridCol w:w="2581"/>
       </w:tblGrid>
       <w:tr>
         <w:trPr>
@@ -4380,7 +4489,19 @@
               <w:rPr>
                 <w:rFonts w:ascii="Times New Roman" w:hAnsi="Times New Roman" w:cs="Times New Roman"/>
               </w:rPr>
-              <w:t xml:space="preserve"> API (Llama 3.3 70B Versatile)</w:t>
+              <w:t xml:space="preserve"> API (Llama </w:t>
+            </w:r>
+            <w:r>
+              <w:rPr>
+                <w:rFonts w:ascii="Times New Roman" w:hAnsi="Times New Roman" w:cs="Times New Roman"/>
+              </w:rPr>
+              <w:t>4</w:t>
+            </w:r>
+            <w:r>
+              <w:rPr>
+                <w:rFonts w:ascii="Times New Roman" w:hAnsi="Times New Roman" w:cs="Times New Roman"/>
+              </w:rPr>
+              <w:t>)</w:t>
             </w:r>
           </w:p>
         </w:tc>
@@ -5169,21 +5290,53 @@
           <w:sz w:val="28"/>
           <w:szCs w:val="28"/>
         </w:rPr>
-        <w:t>Llama 3.3 Evaluation Module</w:t>
-      </w:r>
-    </w:p>
-    <w:p>
-      <w:pPr>
-        <w:jc w:val="both"/>
-        <w:rPr>
-          <w:rFonts w:ascii="Times New Roman" w:hAnsi="Times New Roman" w:cs="Times New Roman"/>
-        </w:rPr>
-      </w:pPr>
-      <w:r>
-        <w:rPr>
-          <w:rFonts w:ascii="Times New Roman" w:hAnsi="Times New Roman" w:cs="Times New Roman"/>
-        </w:rPr>
-        <w:t xml:space="preserve">Llama 3.3 70B Versatile, accessed through the </w:t>
+        <w:t xml:space="preserve">Llama </w:t>
+      </w:r>
+      <w:r>
+        <w:rPr>
+          <w:rFonts w:ascii="Times New Roman" w:hAnsi="Times New Roman" w:cs="Times New Roman"/>
+          <w:b/>
+          <w:bCs/>
+          <w:sz w:val="28"/>
+          <w:szCs w:val="28"/>
+        </w:rPr>
+        <w:t>4</w:t>
+      </w:r>
+      <w:r>
+        <w:rPr>
+          <w:rFonts w:ascii="Times New Roman" w:hAnsi="Times New Roman" w:cs="Times New Roman"/>
+          <w:b/>
+          <w:bCs/>
+          <w:sz w:val="28"/>
+          <w:szCs w:val="28"/>
+        </w:rPr>
+        <w:t xml:space="preserve"> Evaluation Module</w:t>
+      </w:r>
+    </w:p>
+    <w:p>
+      <w:pPr>
+        <w:jc w:val="both"/>
+        <w:rPr>
+          <w:rFonts w:ascii="Times New Roman" w:hAnsi="Times New Roman" w:cs="Times New Roman"/>
+        </w:rPr>
+      </w:pPr>
+      <w:r>
+        <w:rPr>
+          <w:rFonts w:ascii="Times New Roman" w:hAnsi="Times New Roman" w:cs="Times New Roman"/>
+        </w:rPr>
+        <w:t>L</w:t>
+      </w:r>
+      <w:r>
+        <w:rPr>
+          <w:rFonts w:ascii="Times New Roman" w:hAnsi="Times New Roman" w:cs="Times New Roman"/>
+        </w:rPr>
+        <w:t>lama-4-scout-17b-16e-instruct</w:t>
+      </w:r>
+      <w:r>
+        <w:rPr>
+          <w:rFonts w:ascii="Times New Roman" w:hAnsi="Times New Roman" w:cs="Times New Roman"/>
+        </w:rPr>
+        <w:t xml:space="preserve">, accessed through the </w:t>
       </w:r>
       <w:proofErr w:type="spellStart"/>
       <w:r>
@@ -5286,7 +5439,19 @@
         <w:rPr>
           <w:rFonts w:ascii="Times New Roman" w:hAnsi="Times New Roman" w:cs="Times New Roman"/>
         </w:rPr>
-        <w:t>2. Send transcript to Llama 3.3 70B Versatile.</w:t>
+        <w:t xml:space="preserve">2. Send transcript to </w:t>
+      </w:r>
+      <w:r>
+        <w:rPr>
+          <w:rFonts w:ascii="Times New Roman" w:hAnsi="Times New Roman" w:cs="Times New Roman"/>
+        </w:rPr>
+        <w:t>L</w:t>
+      </w:r>
+      <w:r>
+        <w:rPr>
+          <w:rFonts w:ascii="Times New Roman" w:hAnsi="Times New Roman" w:cs="Times New Roman"/>
+        </w:rPr>
+        <w:t>lama-4-scout-17b-16e-instruct</w:t>
       </w:r>
     </w:p>
     <w:p>
@@ -6606,7 +6771,16 @@
       </w:r>
       <w:proofErr w:type="spellEnd"/>
       <w:r>
-        <w:t>-hosted Llama 3.3 70B Versatile, which provides higher request throughput while maintaining strong evaluation quality.</w:t>
+        <w:t xml:space="preserve">-hosted </w:t>
+      </w:r>
+      <w:r>
+        <w:t>L</w:t>
+      </w:r>
+      <w:r>
+        <w:t>lama-4-scout-17b-16e-instruct</w:t>
+      </w:r>
+      <w:r>
+        <w:t>, which provides higher request throughput while maintaining strong evaluation quality.</w:t>
       </w:r>
     </w:p>
     <w:p>
@@ -7864,7 +8038,7 @@
         </w:rPr>
         <w:lastRenderedPageBreak/>
         <w:drawing>
-          <wp:anchor distT="0" distB="0" distL="114300" distR="114300" simplePos="0" relativeHeight="251661312" behindDoc="0" locked="0" layoutInCell="1" allowOverlap="1" wp14:anchorId="2237E27C" wp14:editId="6BDBED65">
+          <wp:anchor distT="0" distB="0" distL="114300" distR="114300" simplePos="0" relativeHeight="251661312" behindDoc="0" locked="0" layoutInCell="1" allowOverlap="1" wp14:anchorId="2237E27C" wp14:editId="74E072AE">
             <wp:simplePos x="0" y="0"/>
             <wp:positionH relativeFrom="margin">
               <wp:posOffset>-596900</wp:posOffset>
@@ -7986,7 +8160,7 @@
           <w:noProof/>
         </w:rPr>
         <w:drawing>
-          <wp:anchor distT="0" distB="0" distL="114300" distR="114300" simplePos="0" relativeHeight="251659264" behindDoc="0" locked="0" layoutInCell="1" allowOverlap="1" wp14:anchorId="1B74AD8E" wp14:editId="726A1CB3">
+          <wp:anchor distT="0" distB="0" distL="114300" distR="114300" simplePos="0" relativeHeight="251659264" behindDoc="0" locked="0" layoutInCell="1" allowOverlap="1" wp14:anchorId="1B74AD8E" wp14:editId="7AC8653B">
             <wp:simplePos x="0" y="0"/>
             <wp:positionH relativeFrom="margin">
               <wp:posOffset>-377466</wp:posOffset>

</xml_diff>